<commit_message>
feat: Forschendes Lernen als Themenpfad
</commit_message>
<xml_diff>
--- a/content/07_Vorlagen_und_Praxis/downloads/Vorlage_Angebotsplanung.docx
+++ b/content/07_Vorlagen_und_Praxis/downloads/Vorlage_Angebotsplanung.docx
@@ -71,6 +71,16 @@
     </w:p>
     <w:p>
       <w:r>
+        <w:t xml:space="preserve">Kinderfrage / Forschungsfrage:</w:t>
+      </w:r>
+    </w:p>
+    <w:p>
+      <w:r>
+        <w:t xml:space="preserve">____________________________________________________________</w:t>
+      </w:r>
+    </w:p>
+    <w:p>
+      <w:r>
         <w:t xml:space="preserve">Pädagogisches Ziel:</w:t>
       </w:r>
     </w:p>
@@ -81,7 +91,7 @@
     </w:p>
     <w:p>
       <w:r>
-        <w:t xml:space="preserve">Bezug zu Wiki-Seiten: Projektarbeit, Forschendes Lernen, Partizipation, Angebotsstruktur</w:t>
+        <w:t xml:space="preserve">Bezug zu Wiki-Seiten: Projektarbeit, Forschendes Lernen, Forschendes Lernen im Ganztag, Partizipation, Angebotsstruktur</w:t>
       </w:r>
     </w:p>
     <w:p>
@@ -141,6 +151,11 @@
       </w:r>
     </w:p>
     <w:p>
+      <w:r>
+        <w:t xml:space="preserve">[ ] Bei Forschungsangeboten: Vermutungen, Beobachtungen und offene Fragen der Kinder wurden dokumentiert.</w:t>
+      </w:r>
+    </w:p>
+    <w:p>
       <w:pPr>
         <w:pStyle w:val="Heading1"/>
       </w:pPr>
@@ -161,6 +176,16 @@
     <w:p>
       <w:r>
         <w:t xml:space="preserve">Wo brauchten Kinder Unterstützung?</w:t>
+      </w:r>
+    </w:p>
+    <w:p>
+      <w:r>
+        <w:t xml:space="preserve">____________________________________________________________</w:t>
+      </w:r>
+    </w:p>
+    <w:p>
+      <w:r>
+        <w:t xml:space="preserve">Welche Kinderfrage oder welches Thema sollte weiterverfolgt werden?</w:t>
       </w:r>
     </w:p>
     <w:p>

</xml_diff>